<commit_message>
Report written for chapter 1
</commit_message>
<xml_diff>
--- a/projekti-2-koneoppimisalgoritmit/Anton_Teerioja_harjoitus_2_klusterointi.docx
+++ b/projekti-2-koneoppimisalgoritmit/Anton_Teerioja_harjoitus_2_klusterointi.docx
@@ -4,12 +4,22 @@
   <w:body>
     <w:p>
       <w:r>
-        <w:t>Tässä harjoituksessa käytän tilastotieteen perusmenetelmiä sekä ohjaamattoman oppimisen menetelmiä annetun datan kuvailuun ja analyysiin. Työn tarkoituksena on valmistella data analyysiä varten, tehdä analyysi datalle, vastata tutkimuskysymyksiin sekä esittää yhteenveto analyysistä.</w:t>
+        <w:t>Tässä harjoituksessa</w:t>
+      </w:r>
+      <w:r>
+        <w:t xml:space="preserve"> </w:t>
+      </w:r>
+      <w:r>
+        <w:t>käytän tilastotieteen perusmenetelmiä sekä ohjaamattoman oppimisen menetelmiä annetun datan kuvailuun ja analyysiin. Työn tarkoituksena on valmistella data analyysiä varten, tehdä analyysi datalle, vastata tutkimuskysymyksiin sekä esittää yhteenveto analyysistä.</w:t>
       </w:r>
     </w:p>
     <w:p>
       <w:pPr>
         <w:pStyle w:val="Heading2"/>
+        <w:numPr>
+          <w:ilvl w:val="0"/>
+          <w:numId w:val="4"/>
+        </w:numPr>
         <w:rPr>
           <w:lang w:val="fi-FI"/>
         </w:rPr>
@@ -23,37 +33,43 @@
     </w:p>
     <w:p>
       <w:r>
-        <w:t>Työ alkoi datan lukemisella ja attribuuttien datatyyppien määrittämisellä. Tämä on tärkeää erityisesti kategoristen attribuuttien kannalta, koska niitä pitää käsitellä eri tavalla kuin numeerisia attribuutteja.</w:t>
-      </w:r>
-    </w:p>
-    <w:p>
-      <w:r>
-        <w:t xml:space="preserve">Datan esikäsittelyyn kuuluu puuttuvien arvojen tunnistaminen ja mahdollinen puuttuvien arvojen täyttäminen. Tässä datassa ei ollut puuttuvia arvoja. Tutkimalla attribuuttien tilastollisia arvoja, huomataan että käpyjen määrän pienin arvo on negatiivinen. </w:t>
-      </w:r>
-      <w:r>
-        <w:t xml:space="preserve"> </w:t>
-      </w:r>
-    </w:p>
-    <w:p>
-      <w:r>
-        <w:t>Tämä ei ole mahdollista, joten oletetaan tutkijan näppäilyvirhettä ja otetaan kaikista käpyjen lukumääristä niiden itseisarvot ja asetetaan ne uudestaan käpyjen arvoiksi. Tarkistetaan myös kategoristen muuttujien uniikkien luokkien määrä. Uniikkeja luokkia on vähän ja jokaisessa on usea datapiste, joten kaikki kategoriset attribuutit ovat myös kunnossa. Tässä kohtaa datan esikäsittely on valmis ja datan analyysi voi alkaa.</w:t>
-      </w:r>
-    </w:p>
-    <w:p>
-      <w:r>
-        <w:t>Aloitetaan datan kuvailulla eli mitä muuttujia datasta löytyy ja miten ne ovat jakautuneet.</w:t>
-      </w:r>
-    </w:p>
-    <w:p>
-      <w:r>
-        <w:rPr>
-          <w:noProof/>
-        </w:rPr>
+        <w:t xml:space="preserve">Aloitetaan datan yleisellä kuvailulla. Datasetissä on 300 riviä dataa ja 11 saraketta muuttujia. Sarakkeet voidaan jakaa kolmeen kategoriaan. Numeerisia muuttujia on 7, </w:t>
+      </w:r>
+      <w:r>
+        <w:t>kategorisia muuttujia on 2 ja tutkijoihin liittyviä muuttujia on 2. Datasetissä ei ole puuttuvia arvoja, mutta duplikaattiarvoja on 20 kappaletta.</w:t>
+      </w:r>
+    </w:p>
+    <w:p>
+      <w:r>
+        <w:t xml:space="preserve">Käytetään numeerisia ja kategorisia muuttujia analyysiin ja </w:t>
+      </w:r>
+      <w:proofErr w:type="spellStart"/>
+      <w:r>
+        <w:t>klusterointiin</w:t>
+      </w:r>
+      <w:proofErr w:type="spellEnd"/>
+      <w:r>
+        <w:t xml:space="preserve">. Verrataan </w:t>
+      </w:r>
+      <w:proofErr w:type="spellStart"/>
+      <w:r>
+        <w:t>klusterointia</w:t>
+      </w:r>
+      <w:proofErr w:type="spellEnd"/>
+      <w:r>
+        <w:t xml:space="preserve"> tutkijoiden luokitteluun, jonka avulla voidaan arvioida ovatko tutkijat onnistuneet puiden luokittelussa. Käytetään numeerisia ja kategorisia muuttujia selvittämään mitkä muuttujat ovat enemmän ja mitkä vähemmän informatiivisia, jotta jatkossa voidaan vähentää turhan datan keruuta.</w:t>
+      </w:r>
+    </w:p>
+    <w:p>
+      <w:r>
+        <w:t>Numeeriset muuttujat saavat seuraavia tilastollisia arvoja</w:t>
+      </w:r>
+      <w:r>
         <w:drawing>
-          <wp:inline distT="0" distB="0" distL="0" distR="0" wp14:anchorId="2547A757" wp14:editId="7FC29BB3">
-            <wp:extent cx="5496560" cy="1719730"/>
-            <wp:effectExtent l="0" t="0" r="8890" b="0"/>
-            <wp:docPr id="2130147098" name="Picture 1"/>
+          <wp:inline distT="0" distB="0" distL="0" distR="0" wp14:anchorId="546C3D46" wp14:editId="6817FFEF">
+            <wp:extent cx="5731510" cy="1644650"/>
+            <wp:effectExtent l="0" t="0" r="2540" b="0"/>
+            <wp:docPr id="626448238" name="Picture 1"/>
             <wp:cNvGraphicFramePr>
               <a:graphicFrameLocks xmlns:a="http://schemas.openxmlformats.org/drawingml/2006/main" noChangeAspect="1"/>
             </wp:cNvGraphicFramePr>
@@ -61,11 +77,11 @@
               <a:graphicData uri="http://schemas.openxmlformats.org/drawingml/2006/picture">
                 <pic:pic xmlns:pic="http://schemas.openxmlformats.org/drawingml/2006/picture">
                   <pic:nvPicPr>
-                    <pic:cNvPr id="2130147098" name=""/>
+                    <pic:cNvPr id="626448238" name=""/>
                     <pic:cNvPicPr/>
                   </pic:nvPicPr>
                   <pic:blipFill>
-                    <a:blip r:embed="rId4"/>
+                    <a:blip r:embed="rId7"/>
                     <a:stretch>
                       <a:fillRect/>
                     </a:stretch>
@@ -73,7 +89,7 @@
                   <pic:spPr>
                     <a:xfrm>
                       <a:off x="0" y="0"/>
-                      <a:ext cx="5509685" cy="1723836"/>
+                      <a:ext cx="5731510" cy="1644650"/>
                     </a:xfrm>
                     <a:prstGeom prst="rect">
                       <a:avLst/>
@@ -88,28 +104,35 @@
     </w:p>
     <w:p>
       <w:r>
-        <w:t>Taulukosta nähdään muuttujien määrä sekä seuraavat attribuutit lukumäärä, keskiarvo, keskihajonta, pienin arvo, ensimmäinen kvartaali, toinen kvartaali, kolmas kvartaali ja suurin arvo.</w:t>
-      </w:r>
-    </w:p>
-    <w:p/>
-    <w:p/>
-    <w:p/>
-    <w:p>
-      <w:r>
-        <w:t>Aloitetaan attribuuttien analyysi tarkistamalla ovatko ne normaalisti jakautuneita. Monet tilastolliset mallit olettavat attribuuttien olevan riippumattomia ja normaalisti jakautuneita. Käytetään normaalisuuden testaamiseen Shapiro-Wilkin normaalisuus testiä. Kaikki paitsi yksi numeerinen attribuutti ei ole normaalisti jakautuneita.</w:t>
-      </w:r>
-    </w:p>
-    <w:p>
+        <w:t>Taulukosta nähdään seuraavat tilastolliset arvot lukumäärä, keskiarvo, keskihajonta, pienin ja suurin arvo</w:t>
+      </w:r>
+      <w:r>
+        <w:t xml:space="preserve"> sekä kvartaalit Q1, Q2 ja Q3. Näiden tilastojen vertaus toisiinsa ei ole mielekästä tässä vaiheessa, koska muuttujan skaala vaikuttaa näiden arvojen suuruuteen. Ainoa poikkeava arvo on käpyjen pienin lukumäärä, joka on -10. Tämä ei ole mahdollista, joten korjataan tilanne. Oletetaan, että negatiivinen etuliite on näppäilyvirhe ja otetaan jokaisen kävyn itseisarvo ja asetetaan se jokaisen rivin arvoksi tässä sarakkeessa.</w:t>
+      </w:r>
+    </w:p>
+    <w:p>
+      <w:pPr>
+        <w:tabs>
+          <w:tab w:val="left" w:pos="5780"/>
+        </w:tabs>
+      </w:pPr>
+      <w:r>
+        <w:tab/>
+      </w:r>
+    </w:p>
+    <w:p>
+      <w:r>
+        <w:t>Tarkastellaan numeeristen muuttujien laatikkokuvaajia</w:t>
+      </w:r>
       <w:r>
         <w:rPr>
           <w:noProof/>
         </w:rPr>
-        <w:lastRenderedPageBreak/>
         <w:drawing>
-          <wp:inline distT="0" distB="0" distL="0" distR="0" wp14:anchorId="07101AA9" wp14:editId="2CCB5EE3">
-            <wp:extent cx="1975757" cy="1201068"/>
-            <wp:effectExtent l="0" t="0" r="5715" b="0"/>
-            <wp:docPr id="1505686712" name="Picture 1"/>
+          <wp:inline distT="0" distB="0" distL="0" distR="0" wp14:anchorId="4CFB57E8" wp14:editId="1052AEA0">
+            <wp:extent cx="2940336" cy="2057400"/>
+            <wp:effectExtent l="0" t="0" r="0" b="0"/>
+            <wp:docPr id="1203797615" name="Picture 11"/>
             <wp:cNvGraphicFramePr>
               <a:graphicFrameLocks xmlns:a="http://schemas.openxmlformats.org/drawingml/2006/main" noChangeAspect="1"/>
             </wp:cNvGraphicFramePr>
@@ -117,216 +140,7 @@
               <a:graphicData uri="http://schemas.openxmlformats.org/drawingml/2006/picture">
                 <pic:pic xmlns:pic="http://schemas.openxmlformats.org/drawingml/2006/picture">
                   <pic:nvPicPr>
-                    <pic:cNvPr id="1505686712" name=""/>
-                    <pic:cNvPicPr/>
-                  </pic:nvPicPr>
-                  <pic:blipFill>
-                    <a:blip r:embed="rId5"/>
-                    <a:stretch>
-                      <a:fillRect/>
-                    </a:stretch>
-                  </pic:blipFill>
-                  <pic:spPr>
-                    <a:xfrm>
-                      <a:off x="0" y="0"/>
-                      <a:ext cx="1979798" cy="1203525"/>
-                    </a:xfrm>
-                    <a:prstGeom prst="rect">
-                      <a:avLst/>
-                    </a:prstGeom>
-                  </pic:spPr>
-                </pic:pic>
-              </a:graphicData>
-            </a:graphic>
-          </wp:inline>
-        </w:drawing>
-      </w:r>
-    </w:p>
-    <w:p>
-      <w:r>
-        <w:t>Koska kaikki attribuutit eivät ole normaalisti jakautuneita, käytetään korrelaation laskemiseen Spearmanin korrelaatiokerrointa.</w:t>
-      </w:r>
-    </w:p>
-    <w:p>
-      <w:r>
-        <w:t>Korrelaatiotestin tuloksena vain muutama attribuutti on merkittävästi korreloitunut toisensa kanssa.</w:t>
-      </w:r>
-    </w:p>
-    <w:p>
-      <w:r>
-        <w:t xml:space="preserve"> </w:t>
-      </w:r>
-      <w:r>
-        <w:rPr>
-          <w:noProof/>
-        </w:rPr>
-        <w:drawing>
-          <wp:inline distT="0" distB="0" distL="0" distR="0" wp14:anchorId="5385F310" wp14:editId="235B2604">
-            <wp:extent cx="3619500" cy="784431"/>
-            <wp:effectExtent l="0" t="0" r="0" b="0"/>
-            <wp:docPr id="1427482084" name="Picture 1"/>
-            <wp:cNvGraphicFramePr>
-              <a:graphicFrameLocks xmlns:a="http://schemas.openxmlformats.org/drawingml/2006/main" noChangeAspect="1"/>
-            </wp:cNvGraphicFramePr>
-            <a:graphic xmlns:a="http://schemas.openxmlformats.org/drawingml/2006/main">
-              <a:graphicData uri="http://schemas.openxmlformats.org/drawingml/2006/picture">
-                <pic:pic xmlns:pic="http://schemas.openxmlformats.org/drawingml/2006/picture">
-                  <pic:nvPicPr>
-                    <pic:cNvPr id="1427482084" name=""/>
-                    <pic:cNvPicPr/>
-                  </pic:nvPicPr>
-                  <pic:blipFill>
-                    <a:blip r:embed="rId6"/>
-                    <a:stretch>
-                      <a:fillRect/>
-                    </a:stretch>
-                  </pic:blipFill>
-                  <pic:spPr>
-                    <a:xfrm>
-                      <a:off x="0" y="0"/>
-                      <a:ext cx="3639462" cy="788757"/>
-                    </a:xfrm>
-                    <a:prstGeom prst="rect">
-                      <a:avLst/>
-                    </a:prstGeom>
-                  </pic:spPr>
-                </pic:pic>
-              </a:graphicData>
-            </a:graphic>
-          </wp:inline>
-        </w:drawing>
-      </w:r>
-    </w:p>
-    <w:p>
-      <w:r>
-        <w:t>Näistä attribuuteista kerätään merkittävimmät eli kaarnan paksuus, halkaisija ja sienien läheisyys ominaisuusvektoriksi. Tätä ominaisuusvektoria käytetään K-means klusteroinnissa.</w:t>
-      </w:r>
-    </w:p>
-    <w:p>
-      <w:r>
-        <w:t xml:space="preserve">Viimeinen vaihe </w:t>
-      </w:r>
-      <w:r>
-        <w:t>on normalisoida ominaisuusvektorin arvot, jotta niitä voidaan vertailla etäisyyttä käyttävällä menetelmällä kuten k-means klusteroinnilla.</w:t>
-      </w:r>
-    </w:p>
-    <w:p>
-      <w:pPr>
-        <w:pStyle w:val="Heading2"/>
-        <w:rPr>
-          <w:lang w:val="fi-FI"/>
-        </w:rPr>
-      </w:pPr>
-      <w:r>
-        <w:rPr>
-          <w:lang w:val="fi-FI"/>
-        </w:rPr>
-        <w:t>Tutkimus</w:t>
-      </w:r>
-    </w:p>
-    <w:p>
-      <w:r>
-        <w:t>Tutkimuksen tavoitteena on luokitella tuntemattomien puiden luokat ilman että tiedetään puiden alkuperäistä luokkaa. Tähän tarvitaan ohjaamattoman oppimisen menetelmiä, joista yksi yleisesti käytetyimmistä on K-means klusterointi. K-means jakaa datan K-luokkaan ja pyrkii minimoimaan varianssin jokaisen luokan sisällä. Se on iteratiivinen metodi, joka lisää lähimmän datapisteen luokkaan, käyttäen jotain tiettyä etäisyysmetriikkaa.</w:t>
-      </w:r>
-    </w:p>
-    <w:p>
-      <w:r>
-        <w:t>Alustetaan K-means klusterointi kolmella klusterilla, maksimi iteraatioiden määrällä ja yritysten lukumäärällä. Kun ominaisuusvektori sovitetaan K-means algoritmiin, se valitsee näillä parametreilla parhaan tuloksen. Tämän tuloksena on vektori, joka sisältää arviot puiden luokista. Näiden luokkien avulla voidaan laskea klusteroinnin hyvyyttä arvioiva siluettiarvo. Työn parametreilla saatiin siluettiarvoksi 0.555, joka ei ole erityisen hyvä arvo. Tähän vaikuttaa se, että datassa on vain muutama vahvasti korreloiva attribuutti ja suurin osa attribuuteista ei vaikuta klusteroinnin tehokkuuteen mitenkään.</w:t>
-      </w:r>
-    </w:p>
-    <w:p>
-      <w:r>
-        <w:rPr>
-          <w:noProof/>
-        </w:rPr>
-        <w:drawing>
-          <wp:anchor distT="0" distB="0" distL="114300" distR="114300" simplePos="0" relativeHeight="251659264" behindDoc="0" locked="0" layoutInCell="1" allowOverlap="1" wp14:anchorId="6DA867F6" wp14:editId="3C1A2C46">
-            <wp:simplePos x="0" y="0"/>
-            <wp:positionH relativeFrom="page">
-              <wp:posOffset>4023879</wp:posOffset>
-            </wp:positionH>
-            <wp:positionV relativeFrom="paragraph">
-              <wp:posOffset>408940</wp:posOffset>
-            </wp:positionV>
-            <wp:extent cx="3221182" cy="2587998"/>
-            <wp:effectExtent l="0" t="0" r="0" b="3175"/>
-            <wp:wrapNone/>
-            <wp:docPr id="497606321" name="Picture 3"/>
-            <wp:cNvGraphicFramePr>
-              <a:graphicFrameLocks xmlns:a="http://schemas.openxmlformats.org/drawingml/2006/main" noChangeAspect="1"/>
-            </wp:cNvGraphicFramePr>
-            <a:graphic xmlns:a="http://schemas.openxmlformats.org/drawingml/2006/main">
-              <a:graphicData uri="http://schemas.openxmlformats.org/drawingml/2006/picture">
-                <pic:pic xmlns:pic="http://schemas.openxmlformats.org/drawingml/2006/picture">
-                  <pic:nvPicPr>
-                    <pic:cNvPr id="0" name="Picture 3"/>
-                    <pic:cNvPicPr>
-                      <a:picLocks noChangeAspect="1" noChangeArrowheads="1"/>
-                    </pic:cNvPicPr>
-                  </pic:nvPicPr>
-                  <pic:blipFill>
-                    <a:blip r:embed="rId7">
-                      <a:extLst>
-                        <a:ext uri="{28A0092B-C50C-407E-A947-70E740481C1C}">
-                          <a14:useLocalDpi xmlns:a14="http://schemas.microsoft.com/office/drawing/2010/main" val="0"/>
-                        </a:ext>
-                      </a:extLst>
-                    </a:blip>
-                    <a:srcRect/>
-                    <a:stretch>
-                      <a:fillRect/>
-                    </a:stretch>
-                  </pic:blipFill>
-                  <pic:spPr bwMode="auto">
-                    <a:xfrm>
-                      <a:off x="0" y="0"/>
-                      <a:ext cx="3221182" cy="2587998"/>
-                    </a:xfrm>
-                    <a:prstGeom prst="rect">
-                      <a:avLst/>
-                    </a:prstGeom>
-                    <a:noFill/>
-                    <a:ln>
-                      <a:noFill/>
-                    </a:ln>
-                  </pic:spPr>
-                </pic:pic>
-              </a:graphicData>
-            </a:graphic>
-            <wp14:sizeRelH relativeFrom="margin">
-              <wp14:pctWidth>0</wp14:pctWidth>
-            </wp14:sizeRelH>
-            <wp14:sizeRelV relativeFrom="margin">
-              <wp14:pctHeight>0</wp14:pctHeight>
-            </wp14:sizeRelV>
-          </wp:anchor>
-        </w:drawing>
-      </w:r>
-      <w:r>
-        <w:rPr>
-          <w:noProof/>
-        </w:rPr>
-        <w:drawing>
-          <wp:anchor distT="0" distB="0" distL="114300" distR="114300" simplePos="0" relativeHeight="251658240" behindDoc="0" locked="0" layoutInCell="1" allowOverlap="1" wp14:anchorId="3FFE0904" wp14:editId="5F6D44DE">
-            <wp:simplePos x="0" y="0"/>
-            <wp:positionH relativeFrom="margin">
-              <wp:posOffset>-519546</wp:posOffset>
-            </wp:positionH>
-            <wp:positionV relativeFrom="paragraph">
-              <wp:posOffset>407670</wp:posOffset>
-            </wp:positionV>
-            <wp:extent cx="3213735" cy="2581910"/>
-            <wp:effectExtent l="0" t="0" r="5715" b="8890"/>
-            <wp:wrapNone/>
-            <wp:docPr id="2068861453" name="Picture 1"/>
-            <wp:cNvGraphicFramePr>
-              <a:graphicFrameLocks xmlns:a="http://schemas.openxmlformats.org/drawingml/2006/main" noChangeAspect="1"/>
-            </wp:cNvGraphicFramePr>
-            <a:graphic xmlns:a="http://schemas.openxmlformats.org/drawingml/2006/main">
-              <a:graphicData uri="http://schemas.openxmlformats.org/drawingml/2006/picture">
-                <pic:pic xmlns:pic="http://schemas.openxmlformats.org/drawingml/2006/picture">
-                  <pic:nvPicPr>
-                    <pic:cNvPr id="0" name="Picture 1"/>
+                    <pic:cNvPr id="0" name="Picture 11"/>
                     <pic:cNvPicPr>
                       <a:picLocks noChangeAspect="1" noChangeArrowheads="1"/>
                     </pic:cNvPicPr>
@@ -347,7 +161,7 @@
                   <pic:spPr bwMode="auto">
                     <a:xfrm>
                       <a:off x="0" y="0"/>
-                      <a:ext cx="3213735" cy="2581910"/>
+                      <a:ext cx="2975004" cy="2081658"/>
                     </a:xfrm>
                     <a:prstGeom prst="rect">
                       <a:avLst/>
@@ -360,31 +174,18 @@
                 </pic:pic>
               </a:graphicData>
             </a:graphic>
-          </wp:anchor>
+          </wp:inline>
         </w:drawing>
       </w:r>
-      <w:r>
-        <w:t xml:space="preserve">Klusteroinnin tavoitteena on mahdollisimman pieni varianssi luokan sisällä ja mahdollisimman suuri varianssi luokkien välillä. </w:t>
-      </w:r>
-    </w:p>
-    <w:p>
       <w:r>
         <w:rPr>
           <w:noProof/>
         </w:rPr>
         <w:drawing>
-          <wp:anchor distT="0" distB="0" distL="114300" distR="114300" simplePos="0" relativeHeight="251660288" behindDoc="0" locked="0" layoutInCell="1" allowOverlap="1" wp14:anchorId="14E2C08E" wp14:editId="3E73A60B">
-            <wp:simplePos x="0" y="0"/>
-            <wp:positionH relativeFrom="margin">
-              <wp:align>center</wp:align>
-            </wp:positionH>
-            <wp:positionV relativeFrom="paragraph">
-              <wp:posOffset>2861079</wp:posOffset>
-            </wp:positionV>
-            <wp:extent cx="3616036" cy="2882278"/>
-            <wp:effectExtent l="0" t="0" r="3810" b="0"/>
-            <wp:wrapNone/>
-            <wp:docPr id="119422417" name="Picture 2"/>
+          <wp:inline distT="0" distB="0" distL="0" distR="0" wp14:anchorId="6A073B5D" wp14:editId="00B7FF95">
+            <wp:extent cx="2786621" cy="1937657"/>
+            <wp:effectExtent l="0" t="0" r="0" b="5715"/>
+            <wp:docPr id="1713211536" name="Picture 12"/>
             <wp:cNvGraphicFramePr>
               <a:graphicFrameLocks xmlns:a="http://schemas.openxmlformats.org/drawingml/2006/main" noChangeAspect="1"/>
             </wp:cNvGraphicFramePr>
@@ -392,7 +193,7 @@
               <a:graphicData uri="http://schemas.openxmlformats.org/drawingml/2006/picture">
                 <pic:pic xmlns:pic="http://schemas.openxmlformats.org/drawingml/2006/picture">
                   <pic:nvPicPr>
-                    <pic:cNvPr id="0" name="Picture 2"/>
+                    <pic:cNvPr id="0" name="Picture 12"/>
                     <pic:cNvPicPr>
                       <a:picLocks noChangeAspect="1" noChangeArrowheads="1"/>
                     </pic:cNvPicPr>
@@ -413,7 +214,7 @@
                   <pic:spPr bwMode="auto">
                     <a:xfrm>
                       <a:off x="0" y="0"/>
-                      <a:ext cx="3616036" cy="2882278"/>
+                      <a:ext cx="2804351" cy="1949986"/>
                     </a:xfrm>
                     <a:prstGeom prst="rect">
                       <a:avLst/>
@@ -426,46 +227,19 @@
                 </pic:pic>
               </a:graphicData>
             </a:graphic>
-            <wp14:sizeRelH relativeFrom="margin">
-              <wp14:pctWidth>0</wp14:pctWidth>
-            </wp14:sizeRelH>
-            <wp14:sizeRelV relativeFrom="margin">
-              <wp14:pctHeight>0</wp14:pctHeight>
-            </wp14:sizeRelV>
-          </wp:anchor>
+          </wp:inline>
         </w:drawing>
       </w:r>
-      <w:r>
-        <w:br w:type="page"/>
-      </w:r>
-    </w:p>
-    <w:p>
-      <w:r>
-        <w:lastRenderedPageBreak/>
-        <w:t>Kuvaajista huomataan, että ensimmäisen luokan määrittelee vahvasti sen keskimääräisesti suurempi kaarnan paksuus ja halkaisija. toisen ja kolmannen luokan määrittelee vahvasti kasvaako sieniä niiden ympärillä vai ei. Toisen luokan puiden ympärillä ei kasva sieniä ja kolmannen luokan ympärillä kasvaa sieniä. Tällä perusteella puut on nyt luokiteltu.</w:t>
-      </w:r>
-    </w:p>
-    <w:p>
-      <w:r>
-        <w:t>Seuraavaksi tarkastellaan, kuinka hyvin tutkijat onnistuivat tunnistamaan puita. Lasketaan jokaiselle tutkijalle Accuracy score. Tämä arvo kertoo</w:t>
-      </w:r>
-      <w:r>
-        <w:t>,</w:t>
-      </w:r>
-      <w:r>
-        <w:t xml:space="preserve"> kuinka monta oikeaa tunnistusta tutkija on tehnyt per kaikki tunnistukset.</w:t>
-      </w:r>
-    </w:p>
-    <w:p>
       <w:r>
         <w:rPr>
           <w:noProof/>
         </w:rPr>
+        <w:lastRenderedPageBreak/>
         <w:drawing>
-          <wp:inline distT="0" distB="0" distL="0" distR="0" wp14:anchorId="621A2F68" wp14:editId="2AF8AA6B">
-            <wp:extent cx="3477491" cy="841553"/>
-            <wp:effectExtent l="0" t="0" r="8890" b="0"/>
-            <wp:docPr id="1451721388" name="Picture 1"/>
+          <wp:inline distT="0" distB="0" distL="0" distR="0" wp14:anchorId="318D5CCB" wp14:editId="7C859D0F">
+            <wp:extent cx="2873829" cy="1981542"/>
+            <wp:effectExtent l="0" t="0" r="3175" b="0"/>
+            <wp:docPr id="179726120" name="Picture 13"/>
             <wp:cNvGraphicFramePr>
               <a:graphicFrameLocks xmlns:a="http://schemas.openxmlformats.org/drawingml/2006/main" noChangeAspect="1"/>
             </wp:cNvGraphicFramePr>
@@ -473,11 +247,286 @@
               <a:graphicData uri="http://schemas.openxmlformats.org/drawingml/2006/picture">
                 <pic:pic xmlns:pic="http://schemas.openxmlformats.org/drawingml/2006/picture">
                   <pic:nvPicPr>
-                    <pic:cNvPr id="1451721388" name=""/>
+                    <pic:cNvPr id="0" name="Picture 13"/>
+                    <pic:cNvPicPr>
+                      <a:picLocks noChangeAspect="1" noChangeArrowheads="1"/>
+                    </pic:cNvPicPr>
+                  </pic:nvPicPr>
+                  <pic:blipFill>
+                    <a:blip r:embed="rId10">
+                      <a:extLst>
+                        <a:ext uri="{28A0092B-C50C-407E-A947-70E740481C1C}">
+                          <a14:useLocalDpi xmlns:a14="http://schemas.microsoft.com/office/drawing/2010/main" val="0"/>
+                        </a:ext>
+                      </a:extLst>
+                    </a:blip>
+                    <a:srcRect/>
+                    <a:stretch>
+                      <a:fillRect/>
+                    </a:stretch>
+                  </pic:blipFill>
+                  <pic:spPr bwMode="auto">
+                    <a:xfrm>
+                      <a:off x="0" y="0"/>
+                      <a:ext cx="2884343" cy="1988791"/>
+                    </a:xfrm>
+                    <a:prstGeom prst="rect">
+                      <a:avLst/>
+                    </a:prstGeom>
+                    <a:noFill/>
+                    <a:ln>
+                      <a:noFill/>
+                    </a:ln>
+                  </pic:spPr>
+                </pic:pic>
+              </a:graphicData>
+            </a:graphic>
+          </wp:inline>
+        </w:drawing>
+      </w:r>
+      <w:r>
+        <w:rPr>
+          <w:noProof/>
+        </w:rPr>
+        <w:drawing>
+          <wp:inline distT="0" distB="0" distL="0" distR="0" wp14:anchorId="0FD1BF2E" wp14:editId="4E6DCF7C">
+            <wp:extent cx="2786048" cy="1926771"/>
+            <wp:effectExtent l="0" t="0" r="0" b="0"/>
+            <wp:docPr id="42079506" name="Picture 14"/>
+            <wp:cNvGraphicFramePr>
+              <a:graphicFrameLocks xmlns:a="http://schemas.openxmlformats.org/drawingml/2006/main" noChangeAspect="1"/>
+            </wp:cNvGraphicFramePr>
+            <a:graphic xmlns:a="http://schemas.openxmlformats.org/drawingml/2006/main">
+              <a:graphicData uri="http://schemas.openxmlformats.org/drawingml/2006/picture">
+                <pic:pic xmlns:pic="http://schemas.openxmlformats.org/drawingml/2006/picture">
+                  <pic:nvPicPr>
+                    <pic:cNvPr id="0" name="Picture 14"/>
+                    <pic:cNvPicPr>
+                      <a:picLocks noChangeAspect="1" noChangeArrowheads="1"/>
+                    </pic:cNvPicPr>
+                  </pic:nvPicPr>
+                  <pic:blipFill>
+                    <a:blip r:embed="rId11">
+                      <a:extLst>
+                        <a:ext uri="{28A0092B-C50C-407E-A947-70E740481C1C}">
+                          <a14:useLocalDpi xmlns:a14="http://schemas.microsoft.com/office/drawing/2010/main" val="0"/>
+                        </a:ext>
+                      </a:extLst>
+                    </a:blip>
+                    <a:srcRect/>
+                    <a:stretch>
+                      <a:fillRect/>
+                    </a:stretch>
+                  </pic:blipFill>
+                  <pic:spPr bwMode="auto">
+                    <a:xfrm>
+                      <a:off x="0" y="0"/>
+                      <a:ext cx="2810890" cy="1943951"/>
+                    </a:xfrm>
+                    <a:prstGeom prst="rect">
+                      <a:avLst/>
+                    </a:prstGeom>
+                    <a:noFill/>
+                    <a:ln>
+                      <a:noFill/>
+                    </a:ln>
+                  </pic:spPr>
+                </pic:pic>
+              </a:graphicData>
+            </a:graphic>
+          </wp:inline>
+        </w:drawing>
+      </w:r>
+      <w:r>
+        <w:rPr>
+          <w:noProof/>
+        </w:rPr>
+        <w:drawing>
+          <wp:inline distT="0" distB="0" distL="0" distR="0" wp14:anchorId="47ACB5F9" wp14:editId="221E4192">
+            <wp:extent cx="2881667" cy="1926771"/>
+            <wp:effectExtent l="0" t="0" r="0" b="0"/>
+            <wp:docPr id="1256106112" name="Picture 15"/>
+            <wp:cNvGraphicFramePr>
+              <a:graphicFrameLocks xmlns:a="http://schemas.openxmlformats.org/drawingml/2006/main" noChangeAspect="1"/>
+            </wp:cNvGraphicFramePr>
+            <a:graphic xmlns:a="http://schemas.openxmlformats.org/drawingml/2006/main">
+              <a:graphicData uri="http://schemas.openxmlformats.org/drawingml/2006/picture">
+                <pic:pic xmlns:pic="http://schemas.openxmlformats.org/drawingml/2006/picture">
+                  <pic:nvPicPr>
+                    <pic:cNvPr id="0" name="Picture 15"/>
+                    <pic:cNvPicPr>
+                      <a:picLocks noChangeAspect="1" noChangeArrowheads="1"/>
+                    </pic:cNvPicPr>
+                  </pic:nvPicPr>
+                  <pic:blipFill>
+                    <a:blip r:embed="rId12">
+                      <a:extLst>
+                        <a:ext uri="{28A0092B-C50C-407E-A947-70E740481C1C}">
+                          <a14:useLocalDpi xmlns:a14="http://schemas.microsoft.com/office/drawing/2010/main" val="0"/>
+                        </a:ext>
+                      </a:extLst>
+                    </a:blip>
+                    <a:srcRect/>
+                    <a:stretch>
+                      <a:fillRect/>
+                    </a:stretch>
+                  </pic:blipFill>
+                  <pic:spPr bwMode="auto">
+                    <a:xfrm>
+                      <a:off x="0" y="0"/>
+                      <a:ext cx="2889819" cy="1932222"/>
+                    </a:xfrm>
+                    <a:prstGeom prst="rect">
+                      <a:avLst/>
+                    </a:prstGeom>
+                    <a:noFill/>
+                    <a:ln>
+                      <a:noFill/>
+                    </a:ln>
+                  </pic:spPr>
+                </pic:pic>
+              </a:graphicData>
+            </a:graphic>
+          </wp:inline>
+        </w:drawing>
+      </w:r>
+      <w:r>
+        <w:rPr>
+          <w:noProof/>
+        </w:rPr>
+        <w:drawing>
+          <wp:inline distT="0" distB="0" distL="0" distR="0" wp14:anchorId="6FFF25BA" wp14:editId="4FB29F15">
+            <wp:extent cx="2794395" cy="1926771"/>
+            <wp:effectExtent l="0" t="0" r="6350" b="0"/>
+            <wp:docPr id="748020490" name="Picture 16"/>
+            <wp:cNvGraphicFramePr>
+              <a:graphicFrameLocks xmlns:a="http://schemas.openxmlformats.org/drawingml/2006/main" noChangeAspect="1"/>
+            </wp:cNvGraphicFramePr>
+            <a:graphic xmlns:a="http://schemas.openxmlformats.org/drawingml/2006/main">
+              <a:graphicData uri="http://schemas.openxmlformats.org/drawingml/2006/picture">
+                <pic:pic xmlns:pic="http://schemas.openxmlformats.org/drawingml/2006/picture">
+                  <pic:nvPicPr>
+                    <pic:cNvPr id="0" name="Picture 16"/>
+                    <pic:cNvPicPr>
+                      <a:picLocks noChangeAspect="1" noChangeArrowheads="1"/>
+                    </pic:cNvPicPr>
+                  </pic:nvPicPr>
+                  <pic:blipFill>
+                    <a:blip r:embed="rId13">
+                      <a:extLst>
+                        <a:ext uri="{28A0092B-C50C-407E-A947-70E740481C1C}">
+                          <a14:useLocalDpi xmlns:a14="http://schemas.microsoft.com/office/drawing/2010/main" val="0"/>
+                        </a:ext>
+                      </a:extLst>
+                    </a:blip>
+                    <a:srcRect/>
+                    <a:stretch>
+                      <a:fillRect/>
+                    </a:stretch>
+                  </pic:blipFill>
+                  <pic:spPr bwMode="auto">
+                    <a:xfrm>
+                      <a:off x="0" y="0"/>
+                      <a:ext cx="2824520" cy="1947543"/>
+                    </a:xfrm>
+                    <a:prstGeom prst="rect">
+                      <a:avLst/>
+                    </a:prstGeom>
+                    <a:noFill/>
+                    <a:ln>
+                      <a:noFill/>
+                    </a:ln>
+                  </pic:spPr>
+                </pic:pic>
+              </a:graphicData>
+            </a:graphic>
+          </wp:inline>
+        </w:drawing>
+      </w:r>
+      <w:r>
+        <w:rPr>
+          <w:noProof/>
+        </w:rPr>
+        <w:drawing>
+          <wp:inline distT="0" distB="0" distL="0" distR="0" wp14:anchorId="263BC0AC" wp14:editId="0AF8180F">
+            <wp:extent cx="3080658" cy="2106743"/>
+            <wp:effectExtent l="0" t="0" r="5715" b="8255"/>
+            <wp:docPr id="1175937149" name="Picture 20"/>
+            <wp:cNvGraphicFramePr>
+              <a:graphicFrameLocks xmlns:a="http://schemas.openxmlformats.org/drawingml/2006/main" noChangeAspect="1"/>
+            </wp:cNvGraphicFramePr>
+            <a:graphic xmlns:a="http://schemas.openxmlformats.org/drawingml/2006/main">
+              <a:graphicData uri="http://schemas.openxmlformats.org/drawingml/2006/picture">
+                <pic:pic xmlns:pic="http://schemas.openxmlformats.org/drawingml/2006/picture">
+                  <pic:nvPicPr>
+                    <pic:cNvPr id="0" name="Picture 20"/>
+                    <pic:cNvPicPr>
+                      <a:picLocks noChangeAspect="1" noChangeArrowheads="1"/>
+                    </pic:cNvPicPr>
+                  </pic:nvPicPr>
+                  <pic:blipFill>
+                    <a:blip r:embed="rId14">
+                      <a:extLst>
+                        <a:ext uri="{28A0092B-C50C-407E-A947-70E740481C1C}">
+                          <a14:useLocalDpi xmlns:a14="http://schemas.microsoft.com/office/drawing/2010/main" val="0"/>
+                        </a:ext>
+                      </a:extLst>
+                    </a:blip>
+                    <a:srcRect/>
+                    <a:stretch>
+                      <a:fillRect/>
+                    </a:stretch>
+                  </pic:blipFill>
+                  <pic:spPr bwMode="auto">
+                    <a:xfrm>
+                      <a:off x="0" y="0"/>
+                      <a:ext cx="3104960" cy="2123363"/>
+                    </a:xfrm>
+                    <a:prstGeom prst="rect">
+                      <a:avLst/>
+                    </a:prstGeom>
+                    <a:noFill/>
+                    <a:ln>
+                      <a:noFill/>
+                    </a:ln>
+                  </pic:spPr>
+                </pic:pic>
+              </a:graphicData>
+            </a:graphic>
+          </wp:inline>
+        </w:drawing>
+      </w:r>
+    </w:p>
+    <w:p/>
+    <w:p>
+      <w:r>
+        <w:t>Kuvaajista huomataan kaikkien arvojen olevan lähes symmetrisesti jakautuneita. Suurimpia poikkeavia arvoja saadaan siemenen koolla, joka saa suurimman osan arvoistaan hyvin kapealta väliltä, mutta myös paljon poikkeavia arvoja.</w:t>
+      </w:r>
+    </w:p>
+    <w:p>
+      <w:r>
+        <w:t xml:space="preserve">Kategorisille muuttujille voidaan myös laskea attribuutteja. </w:t>
+      </w:r>
+    </w:p>
+    <w:p>
+      <w:r>
+        <w:drawing>
+          <wp:inline distT="0" distB="0" distL="0" distR="0" wp14:anchorId="4B1077B2" wp14:editId="51CCD030">
+            <wp:extent cx="3696216" cy="1409897"/>
+            <wp:effectExtent l="0" t="0" r="0" b="0"/>
+            <wp:docPr id="909865477" name="Picture 1"/>
+            <wp:cNvGraphicFramePr>
+              <a:graphicFrameLocks xmlns:a="http://schemas.openxmlformats.org/drawingml/2006/main" noChangeAspect="1"/>
+            </wp:cNvGraphicFramePr>
+            <a:graphic xmlns:a="http://schemas.openxmlformats.org/drawingml/2006/main">
+              <a:graphicData uri="http://schemas.openxmlformats.org/drawingml/2006/picture">
+                <pic:pic xmlns:pic="http://schemas.openxmlformats.org/drawingml/2006/picture">
+                  <pic:nvPicPr>
+                    <pic:cNvPr id="909865477" name=""/>
                     <pic:cNvPicPr/>
                   </pic:nvPicPr>
                   <pic:blipFill>
-                    <a:blip r:embed="rId10"/>
+                    <a:blip r:embed="rId15"/>
                     <a:stretch>
                       <a:fillRect/>
                     </a:stretch>
@@ -485,7 +534,7 @@
                   <pic:spPr>
                     <a:xfrm>
                       <a:off x="0" y="0"/>
-                      <a:ext cx="3489692" cy="844506"/>
+                      <a:ext cx="3696216" cy="1409897"/>
                     </a:xfrm>
                     <a:prstGeom prst="rect">
                       <a:avLst/>
@@ -500,46 +549,329 @@
     </w:p>
     <w:p>
       <w:r>
-        <w:t>Analyysin perusteella tutkija 3, on paras tunnistamaan puita.</w:t>
-      </w:r>
-    </w:p>
-    <w:p>
-      <w:pPr>
-        <w:pStyle w:val="Heading2"/>
-        <w:rPr>
-          <w:lang w:val="fi-FI"/>
-        </w:rPr>
-      </w:pPr>
-      <w:r>
-        <w:rPr>
-          <w:lang w:val="fi-FI"/>
-        </w:rPr>
-        <w:t>3. Loppupäätelmät</w:t>
-      </w:r>
-    </w:p>
-    <w:p>
-      <w:r>
-        <w:t>Analyysin alussa haluttiin selvittää vastaukset kahteen tutkimuskysymykseen. TK1 on</w:t>
-      </w:r>
-      <w:r>
-        <w:t>,</w:t>
-      </w:r>
-      <w:r>
-        <w:t xml:space="preserve"> kuka biologeista luokitteli puut parhaiten ja TK2 on mitkä attribuutit luokittelevat datan parhaiten. Vastaus ensimmäiseen tutkimuskysymykseen on tutkija 3, jos tarkkuus on ainoa metriikka tunnistuksen hyvyyden laskemiseen. Toinen vaihtoehtoinen tapa laskea tarkkuuden hyvyys on Recall score, joka laskee</w:t>
-      </w:r>
-      <w:r>
-        <w:t>,</w:t>
-      </w:r>
-      <w:r>
-        <w:t xml:space="preserve"> </w:t>
-      </w:r>
-      <w:r>
-        <w:t>k</w:t>
-      </w:r>
-      <w:r>
-        <w:t>uinka monta puuta on tunnistettu oikein per oikein ja väärät negatiiviset. Toisen tutkimuskysymyksen vastaus on kaarnan paksuus, halkaisija sekä sienien läheisyys. Nämä attribuutit saivat aikaan parhaan klusteroinnin sekä niistä näkyy selvästi klusterien välinen varianssi sekä klusterin sisäinen pieni varianssi.</w:t>
-      </w:r>
-    </w:p>
+        <w:lastRenderedPageBreak/>
+        <w:t>Kuvan taulukosta nähdään seuraavat tilastot lukumäärä, uniikkien luokkien lukumäärä, moodi ja moodin taajuus. Sienien olemassaolon kategoria on lähes symmetrisesti jakautunut kahteen, mutta värin kategorioiden jakaumaa ei vielä saa selville tästä. Käytetään</w:t>
+      </w:r>
+      <w:r>
+        <w:t xml:space="preserve"> ristitaulukkoa eri kategoristen arvojen esiintymisen listaukseen.</w:t>
+      </w:r>
+    </w:p>
+    <w:p>
+      <w:r>
+        <w:drawing>
+          <wp:inline distT="0" distB="0" distL="0" distR="0" wp14:anchorId="659FBD89" wp14:editId="665CA762">
+            <wp:extent cx="3092521" cy="2709784"/>
+            <wp:effectExtent l="0" t="0" r="0" b="0"/>
+            <wp:docPr id="2133958916" name="Picture 1"/>
+            <wp:cNvGraphicFramePr>
+              <a:graphicFrameLocks xmlns:a="http://schemas.openxmlformats.org/drawingml/2006/main" noChangeAspect="1"/>
+            </wp:cNvGraphicFramePr>
+            <a:graphic xmlns:a="http://schemas.openxmlformats.org/drawingml/2006/main">
+              <a:graphicData uri="http://schemas.openxmlformats.org/drawingml/2006/picture">
+                <pic:pic xmlns:pic="http://schemas.openxmlformats.org/drawingml/2006/picture">
+                  <pic:nvPicPr>
+                    <pic:cNvPr id="2133958916" name=""/>
+                    <pic:cNvPicPr/>
+                  </pic:nvPicPr>
+                  <pic:blipFill>
+                    <a:blip r:embed="rId16"/>
+                    <a:stretch>
+                      <a:fillRect/>
+                    </a:stretch>
+                  </pic:blipFill>
+                  <pic:spPr>
+                    <a:xfrm>
+                      <a:off x="0" y="0"/>
+                      <a:ext cx="3101926" cy="2718025"/>
+                    </a:xfrm>
+                    <a:prstGeom prst="rect">
+                      <a:avLst/>
+                    </a:prstGeom>
+                  </pic:spPr>
+                </pic:pic>
+              </a:graphicData>
+            </a:graphic>
+          </wp:inline>
+        </w:drawing>
+      </w:r>
+    </w:p>
+    <w:p>
+      <w:r>
+        <w:t>Taulukosta nähdään, että kaikkia yhdistelmiä kategorisia arvoja on olemassa datasetissä, joten joidenkin yhdistelmien puuttumista ei tarvitse ottaa huomioon loppuanalyysissä.</w:t>
+      </w:r>
+    </w:p>
+    <w:p/>
+    <w:p>
+      <w:r>
+        <w:t xml:space="preserve">Seuraavaksi tutkitaan, ovatko numeeriset muuttujat normaalisti jakautuneita. Normaalisti jakautuneet muuttujat eivät sovellu suoraan ohjaamattomaan oppimiseen, koska niiden satunnaisuuden vuoksi niistä ei voi muodostaa selviä alueita. Lisäksi tilastollisten testien valinta edellyttää tietoa datan normaalijakautuneisuudesta. Käytetään </w:t>
+      </w:r>
+      <w:proofErr w:type="spellStart"/>
+      <w:r>
+        <w:t>Shapiro-Wilkin</w:t>
+      </w:r>
+      <w:proofErr w:type="spellEnd"/>
+      <w:r>
+        <w:t xml:space="preserve"> normaalisuustestiä numeerisiin muuttujiin.</w:t>
+      </w:r>
+    </w:p>
+    <w:p>
+      <w:r>
+        <w:drawing>
+          <wp:inline distT="0" distB="0" distL="0" distR="0" wp14:anchorId="6520887A" wp14:editId="1BDEDBD5">
+            <wp:extent cx="3043353" cy="1921268"/>
+            <wp:effectExtent l="0" t="0" r="5080" b="3175"/>
+            <wp:docPr id="178141213" name="Picture 1"/>
+            <wp:cNvGraphicFramePr>
+              <a:graphicFrameLocks xmlns:a="http://schemas.openxmlformats.org/drawingml/2006/main" noChangeAspect="1"/>
+            </wp:cNvGraphicFramePr>
+            <a:graphic xmlns:a="http://schemas.openxmlformats.org/drawingml/2006/main">
+              <a:graphicData uri="http://schemas.openxmlformats.org/drawingml/2006/picture">
+                <pic:pic xmlns:pic="http://schemas.openxmlformats.org/drawingml/2006/picture">
+                  <pic:nvPicPr>
+                    <pic:cNvPr id="178141213" name=""/>
+                    <pic:cNvPicPr/>
+                  </pic:nvPicPr>
+                  <pic:blipFill>
+                    <a:blip r:embed="rId17"/>
+                    <a:stretch>
+                      <a:fillRect/>
+                    </a:stretch>
+                  </pic:blipFill>
+                  <pic:spPr>
+                    <a:xfrm>
+                      <a:off x="0" y="0"/>
+                      <a:ext cx="3048074" cy="1924249"/>
+                    </a:xfrm>
+                    <a:prstGeom prst="rect">
+                      <a:avLst/>
+                    </a:prstGeom>
+                  </pic:spPr>
+                </pic:pic>
+              </a:graphicData>
+            </a:graphic>
+          </wp:inline>
+        </w:drawing>
+      </w:r>
+    </w:p>
+    <w:p>
+      <w:r>
+        <w:t xml:space="preserve">Huomataan, että maan </w:t>
+      </w:r>
+      <w:proofErr w:type="spellStart"/>
+      <w:r>
+        <w:t>ph</w:t>
+      </w:r>
+      <w:proofErr w:type="spellEnd"/>
+      <w:r>
+        <w:t xml:space="preserve"> on normaalisti jakautunut, joten sitä ei käytetä lopullisen muuttujavektorin muuttujissa. Muut arvot eivät ole normaalisti jakautuneita, joka auttaa ohjaamattomassa oppimisessa.</w:t>
+      </w:r>
+    </w:p>
+    <w:p>
+      <w:r>
+        <w:t xml:space="preserve">Lasketaan numeeristen muuttujien korrelaatiokertoimet </w:t>
+      </w:r>
+      <w:proofErr w:type="spellStart"/>
+      <w:r>
+        <w:t>Spearmanin</w:t>
+      </w:r>
+      <w:proofErr w:type="spellEnd"/>
+      <w:r>
+        <w:t xml:space="preserve"> avulla. Valitaan </w:t>
+      </w:r>
+      <w:proofErr w:type="spellStart"/>
+      <w:r>
+        <w:t>Spearman</w:t>
+      </w:r>
+      <w:proofErr w:type="spellEnd"/>
+      <w:r>
+        <w:t>, koska muuttujat eivät ole normaalisti jakautuneita. Testin tuloksista havaitaan, kuinka paljon yhteisvaihtelua muuttujilla on. Vahvasti korreloituneet muuttujat sisältävät paljon samaa tietoa, joka voi heikentää ohjaamattoman oppimisen tuloksia.</w:t>
+      </w:r>
+    </w:p>
+    <w:p>
+      <w:r>
+        <w:lastRenderedPageBreak/>
+        <w:drawing>
+          <wp:inline distT="0" distB="0" distL="0" distR="0" wp14:anchorId="2D8106A2" wp14:editId="11ECF255">
+            <wp:extent cx="4236662" cy="4500081"/>
+            <wp:effectExtent l="0" t="0" r="0" b="0"/>
+            <wp:docPr id="1879974400" name="Picture 1"/>
+            <wp:cNvGraphicFramePr>
+              <a:graphicFrameLocks xmlns:a="http://schemas.openxmlformats.org/drawingml/2006/main" noChangeAspect="1"/>
+            </wp:cNvGraphicFramePr>
+            <a:graphic xmlns:a="http://schemas.openxmlformats.org/drawingml/2006/main">
+              <a:graphicData uri="http://schemas.openxmlformats.org/drawingml/2006/picture">
+                <pic:pic xmlns:pic="http://schemas.openxmlformats.org/drawingml/2006/picture">
+                  <pic:nvPicPr>
+                    <pic:cNvPr id="1879974400" name=""/>
+                    <pic:cNvPicPr/>
+                  </pic:nvPicPr>
+                  <pic:blipFill>
+                    <a:blip r:embed="rId18"/>
+                    <a:stretch>
+                      <a:fillRect/>
+                    </a:stretch>
+                  </pic:blipFill>
+                  <pic:spPr>
+                    <a:xfrm>
+                      <a:off x="0" y="0"/>
+                      <a:ext cx="4239234" cy="4502813"/>
+                    </a:xfrm>
+                    <a:prstGeom prst="rect">
+                      <a:avLst/>
+                    </a:prstGeom>
+                  </pic:spPr>
+                </pic:pic>
+              </a:graphicData>
+            </a:graphic>
+          </wp:inline>
+        </w:drawing>
+      </w:r>
+    </w:p>
+    <w:p>
+      <w:r>
+        <w:t>Taulukosta nähdään seuraavien muuttujien olevan korreloituneita toistensa kanssa. Halkaisija-pituus, kaarna-pituus ja kaarna-halkaisija. Huomataan näiden kolmen muuttujan olevan korreloituneita toistensa kanssa, joten muuttujavektorissa tulee olla vain yksi näistä samaan aikaan.</w:t>
+      </w:r>
+    </w:p>
+    <w:p>
+      <w:r>
+        <w:t xml:space="preserve">Lasketaan seuraavaksi kategoristen muuttujien korrelaation </w:t>
+      </w:r>
+      <w:proofErr w:type="spellStart"/>
+      <w:r>
+        <w:t>Khinin</w:t>
+      </w:r>
+      <w:proofErr w:type="spellEnd"/>
+      <w:r>
+        <w:t xml:space="preserve"> neliötestillä.</w:t>
+      </w:r>
+    </w:p>
+    <w:p>
+      <w:r>
+        <w:drawing>
+          <wp:inline distT="0" distB="0" distL="0" distR="0" wp14:anchorId="0FF466B0" wp14:editId="26CA3784">
+            <wp:extent cx="4792257" cy="280867"/>
+            <wp:effectExtent l="0" t="0" r="0" b="5080"/>
+            <wp:docPr id="64057638" name="Picture 1"/>
+            <wp:cNvGraphicFramePr>
+              <a:graphicFrameLocks xmlns:a="http://schemas.openxmlformats.org/drawingml/2006/main" noChangeAspect="1"/>
+            </wp:cNvGraphicFramePr>
+            <a:graphic xmlns:a="http://schemas.openxmlformats.org/drawingml/2006/main">
+              <a:graphicData uri="http://schemas.openxmlformats.org/drawingml/2006/picture">
+                <pic:pic xmlns:pic="http://schemas.openxmlformats.org/drawingml/2006/picture">
+                  <pic:nvPicPr>
+                    <pic:cNvPr id="64057638" name=""/>
+                    <pic:cNvPicPr/>
+                  </pic:nvPicPr>
+                  <pic:blipFill>
+                    <a:blip r:embed="rId19"/>
+                    <a:stretch>
+                      <a:fillRect/>
+                    </a:stretch>
+                  </pic:blipFill>
+                  <pic:spPr>
+                    <a:xfrm>
+                      <a:off x="0" y="0"/>
+                      <a:ext cx="4810475" cy="281935"/>
+                    </a:xfrm>
+                    <a:prstGeom prst="rect">
+                      <a:avLst/>
+                    </a:prstGeom>
+                  </pic:spPr>
+                </pic:pic>
+              </a:graphicData>
+            </a:graphic>
+          </wp:inline>
+        </w:drawing>
+      </w:r>
+    </w:p>
+    <w:p>
+      <w:r>
+        <w:t>Värin ja sienien välillä ei ole vahvaa korrelaatiota.</w:t>
+      </w:r>
+    </w:p>
+    <w:p>
+      <w:r>
+        <w:t xml:space="preserve">Lopuksi verrataan vielä kategoristen ja numeeristen muuttujien jakaumien eroa </w:t>
+      </w:r>
+      <w:proofErr w:type="spellStart"/>
+      <w:r>
+        <w:t>kruskal-walliksen</w:t>
+      </w:r>
+      <w:proofErr w:type="spellEnd"/>
+      <w:r>
+        <w:t xml:space="preserve"> testillä. Tämän testin tuloksena saadaan tietää, onko kahden eri muuttujan hajontojen ero merkittävä vai ei. Jos hajonnat ovat merkittäviä, halutaan molemmat muuttujavektoriin, koska eri hajonnat tuottavat parempia klustereita.</w:t>
+      </w:r>
+    </w:p>
+    <w:p>
+      <w:r>
+        <w:lastRenderedPageBreak/>
+        <w:drawing>
+          <wp:inline distT="0" distB="0" distL="0" distR="0" wp14:anchorId="492F1C54" wp14:editId="7E20DF73">
+            <wp:extent cx="4617361" cy="2970131"/>
+            <wp:effectExtent l="0" t="0" r="0" b="1905"/>
+            <wp:docPr id="1653128970" name="Picture 1"/>
+            <wp:cNvGraphicFramePr>
+              <a:graphicFrameLocks xmlns:a="http://schemas.openxmlformats.org/drawingml/2006/main" noChangeAspect="1"/>
+            </wp:cNvGraphicFramePr>
+            <a:graphic xmlns:a="http://schemas.openxmlformats.org/drawingml/2006/main">
+              <a:graphicData uri="http://schemas.openxmlformats.org/drawingml/2006/picture">
+                <pic:pic xmlns:pic="http://schemas.openxmlformats.org/drawingml/2006/picture">
+                  <pic:nvPicPr>
+                    <pic:cNvPr id="1653128970" name=""/>
+                    <pic:cNvPicPr/>
+                  </pic:nvPicPr>
+                  <pic:blipFill>
+                    <a:blip r:embed="rId20"/>
+                    <a:stretch>
+                      <a:fillRect/>
+                    </a:stretch>
+                  </pic:blipFill>
+                  <pic:spPr>
+                    <a:xfrm>
+                      <a:off x="0" y="0"/>
+                      <a:ext cx="4628928" cy="2977572"/>
+                    </a:xfrm>
+                    <a:prstGeom prst="rect">
+                      <a:avLst/>
+                    </a:prstGeom>
+                  </pic:spPr>
+                </pic:pic>
+              </a:graphicData>
+            </a:graphic>
+          </wp:inline>
+        </w:drawing>
+      </w:r>
+    </w:p>
+    <w:p>
+      <w:r>
+        <w:t xml:space="preserve">Taulukosta nähdään kahden muuttujan yhdistelmän olevan tilastollisesti merkittävää. Nämä yhdistelmät ovat </w:t>
+      </w:r>
+      <w:proofErr w:type="gramStart"/>
+      <w:r>
+        <w:t>halkaisija-sieni</w:t>
+      </w:r>
+      <w:proofErr w:type="gramEnd"/>
+      <w:r>
+        <w:t xml:space="preserve"> ja </w:t>
+      </w:r>
+      <w:proofErr w:type="gramStart"/>
+      <w:r>
+        <w:t>kaarna-sieni</w:t>
+      </w:r>
+      <w:proofErr w:type="gramEnd"/>
+      <w:r>
+        <w:t xml:space="preserve">. Muuttujavektoria rakentaessa halutaan ainakin nämä yhdistelmät </w:t>
+      </w:r>
+      <w:proofErr w:type="gramStart"/>
+      <w:r>
+        <w:t>ottaa</w:t>
+      </w:r>
+      <w:proofErr w:type="gramEnd"/>
+      <w:r>
+        <w:t xml:space="preserve"> huomioon.</w:t>
+      </w:r>
+    </w:p>
+    <w:p/>
     <w:sectPr>
       <w:pgSz w:w="11906" w:h="16838"/>
       <w:pgMar w:top="1440" w:right="1440" w:bottom="1440" w:left="1440" w:header="708" w:footer="708" w:gutter="0"/>
@@ -548,6 +880,429 @@
     </w:sectPr>
   </w:body>
 </w:document>
+</file>
+
+<file path=word/endnotes.xml><?xml version="1.0" encoding="utf-8"?>
+<w:endnotes xmlns:wpc="http://schemas.microsoft.com/office/word/2010/wordprocessingCanvas" xmlns:cx="http://schemas.microsoft.com/office/drawing/2014/chartex" xmlns:cx1="http://schemas.microsoft.com/office/drawing/2015/9/8/chartex" xmlns:cx2="http://schemas.microsoft.com/office/drawing/2015/10/21/chartex" xmlns:cx3="http://schemas.microsoft.com/office/drawing/2016/5/9/chartex" xmlns:cx4="http://schemas.microsoft.com/office/drawing/2016/5/10/chartex" xmlns:cx5="http://schemas.microsoft.com/office/drawing/2016/5/11/chartex" xmlns:cx6="http://schemas.microsoft.com/office/drawing/2016/5/12/chartex" xmlns:cx7="http://schemas.microsoft.com/office/drawing/2016/5/13/chartex" xmlns:cx8="http://schemas.microsoft.com/office/drawing/2016/5/14/chartex" xmlns:mc="http://schemas.openxmlformats.org/markup-compatibility/2006" xmlns:aink="http://schemas.microsoft.com/office/drawing/2016/ink" xmlns:am3d="http://schemas.microsoft.com/office/drawing/2017/model3d" xmlns:o="urn:schemas-microsoft-com:office:office" xmlns:oel="http://schemas.microsoft.com/office/2019/extlst" xmlns:r="http://schemas.openxmlformats.org/officeDocument/2006/relationships" xmlns:m="http://schemas.openxmlformats.org/officeDocument/2006/math" xmlns:v="urn:schemas-microsoft-com:vml" xmlns:wp14="http://schemas.microsoft.com/office/word/2010/wordprocessingDrawing" xmlns:wp="http://schemas.openxmlformats.org/drawingml/2006/wordprocessingDrawing" xmlns:w10="urn:schemas-microsoft-com:office:word" xmlns:w="http://schemas.openxmlformats.org/wordprocessingml/2006/main" xmlns:w14="http://schemas.microsoft.com/office/word/2010/wordml" xmlns:w15="http://schemas.microsoft.com/office/word/2012/wordml" xmlns:w16cex="http://schemas.microsoft.com/office/word/2018/wordml/cex" xmlns:w16cid="http://schemas.microsoft.com/office/word/2016/wordml/cid" xmlns:w16="http://schemas.microsoft.com/office/word/2018/wordml" xmlns:w16du="http://schemas.microsoft.com/office/word/2023/wordml/word16du" xmlns:w16sdtdh="http://schemas.microsoft.com/office/word/2020/wordml/sdtdatahash" xmlns:w16sdtfl="http://schemas.microsoft.com/office/word/2024/wordml/sdtformatlock" xmlns:w16se="http://schemas.microsoft.com/office/word/2015/wordml/symex" xmlns:wpg="http://schemas.microsoft.com/office/word/2010/wordprocessingGroup" xmlns:wpi="http://schemas.microsoft.com/office/word/2010/wordprocessingInk" xmlns:wne="http://schemas.microsoft.com/office/word/2006/wordml" xmlns:wps="http://schemas.microsoft.com/office/word/2010/wordprocessingShape" mc:Ignorable="w14 w15 w16se w16cid w16 w16cex w16sdtdh w16sdtfl w16du wp14">
+  <w:endnote w:type="separator" w:id="-1">
+    <w:p>
+      <w:pPr>
+        <w:spacing w:after="0" w:line="240" w:lineRule="auto"/>
+      </w:pPr>
+      <w:r>
+        <w:separator/>
+      </w:r>
+    </w:p>
+  </w:endnote>
+  <w:endnote w:type="continuationSeparator" w:id="0">
+    <w:p>
+      <w:pPr>
+        <w:spacing w:after="0" w:line="240" w:lineRule="auto"/>
+      </w:pPr>
+      <w:r>
+        <w:continuationSeparator/>
+      </w:r>
+    </w:p>
+  </w:endnote>
+</w:endnotes>
+</file>
+
+<file path=word/footnotes.xml><?xml version="1.0" encoding="utf-8"?>
+<w:footnotes xmlns:wpc="http://schemas.microsoft.com/office/word/2010/wordprocessingCanvas" xmlns:cx="http://schemas.microsoft.com/office/drawing/2014/chartex" xmlns:cx1="http://schemas.microsoft.com/office/drawing/2015/9/8/chartex" xmlns:cx2="http://schemas.microsoft.com/office/drawing/2015/10/21/chartex" xmlns:cx3="http://schemas.microsoft.com/office/drawing/2016/5/9/chartex" xmlns:cx4="http://schemas.microsoft.com/office/drawing/2016/5/10/chartex" xmlns:cx5="http://schemas.microsoft.com/office/drawing/2016/5/11/chartex" xmlns:cx6="http://schemas.microsoft.com/office/drawing/2016/5/12/chartex" xmlns:cx7="http://schemas.microsoft.com/office/drawing/2016/5/13/chartex" xmlns:cx8="http://schemas.microsoft.com/office/drawing/2016/5/14/chartex" xmlns:mc="http://schemas.openxmlformats.org/markup-compatibility/2006" xmlns:aink="http://schemas.microsoft.com/office/drawing/2016/ink" xmlns:am3d="http://schemas.microsoft.com/office/drawing/2017/model3d" xmlns:o="urn:schemas-microsoft-com:office:office" xmlns:oel="http://schemas.microsoft.com/office/2019/extlst" xmlns:r="http://schemas.openxmlformats.org/officeDocument/2006/relationships" xmlns:m="http://schemas.openxmlformats.org/officeDocument/2006/math" xmlns:v="urn:schemas-microsoft-com:vml" xmlns:wp14="http://schemas.microsoft.com/office/word/2010/wordprocessingDrawing" xmlns:wp="http://schemas.openxmlformats.org/drawingml/2006/wordprocessingDrawing" xmlns:w10="urn:schemas-microsoft-com:office:word" xmlns:w="http://schemas.openxmlformats.org/wordprocessingml/2006/main" xmlns:w14="http://schemas.microsoft.com/office/word/2010/wordml" xmlns:w15="http://schemas.microsoft.com/office/word/2012/wordml" xmlns:w16cex="http://schemas.microsoft.com/office/word/2018/wordml/cex" xmlns:w16cid="http://schemas.microsoft.com/office/word/2016/wordml/cid" xmlns:w16="http://schemas.microsoft.com/office/word/2018/wordml" xmlns:w16du="http://schemas.microsoft.com/office/word/2023/wordml/word16du" xmlns:w16sdtdh="http://schemas.microsoft.com/office/word/2020/wordml/sdtdatahash" xmlns:w16sdtfl="http://schemas.microsoft.com/office/word/2024/wordml/sdtformatlock" xmlns:w16se="http://schemas.microsoft.com/office/word/2015/wordml/symex" xmlns:wpg="http://schemas.microsoft.com/office/word/2010/wordprocessingGroup" xmlns:wpi="http://schemas.microsoft.com/office/word/2010/wordprocessingInk" xmlns:wne="http://schemas.microsoft.com/office/word/2006/wordml" xmlns:wps="http://schemas.microsoft.com/office/word/2010/wordprocessingShape" mc:Ignorable="w14 w15 w16se w16cid w16 w16cex w16sdtdh w16sdtfl w16du wp14">
+  <w:footnote w:type="separator" w:id="-1">
+    <w:p>
+      <w:pPr>
+        <w:spacing w:after="0" w:line="240" w:lineRule="auto"/>
+      </w:pPr>
+      <w:r>
+        <w:separator/>
+      </w:r>
+    </w:p>
+  </w:footnote>
+  <w:footnote w:type="continuationSeparator" w:id="0">
+    <w:p>
+      <w:pPr>
+        <w:spacing w:after="0" w:line="240" w:lineRule="auto"/>
+      </w:pPr>
+      <w:r>
+        <w:continuationSeparator/>
+      </w:r>
+    </w:p>
+  </w:footnote>
+</w:footnotes>
+</file>
+
+<file path=word/numbering.xml><?xml version="1.0" encoding="utf-8"?>
+<w:numbering xmlns:wpc="http://schemas.microsoft.com/office/word/2010/wordprocessingCanvas" xmlns:cx="http://schemas.microsoft.com/office/drawing/2014/chartex" xmlns:cx1="http://schemas.microsoft.com/office/drawing/2015/9/8/chartex" xmlns:cx2="http://schemas.microsoft.com/office/drawing/2015/10/21/chartex" xmlns:cx3="http://schemas.microsoft.com/office/drawing/2016/5/9/chartex" xmlns:cx4="http://schemas.microsoft.com/office/drawing/2016/5/10/chartex" xmlns:cx5="http://schemas.microsoft.com/office/drawing/2016/5/11/chartex" xmlns:cx6="http://schemas.microsoft.com/office/drawing/2016/5/12/chartex" xmlns:cx7="http://schemas.microsoft.com/office/drawing/2016/5/13/chartex" xmlns:cx8="http://schemas.microsoft.com/office/drawing/2016/5/14/chartex" xmlns:mc="http://schemas.openxmlformats.org/markup-compatibility/2006" xmlns:aink="http://schemas.microsoft.com/office/drawing/2016/ink" xmlns:am3d="http://schemas.microsoft.com/office/drawing/2017/model3d" xmlns:o="urn:schemas-microsoft-com:office:office" xmlns:oel="http://schemas.microsoft.com/office/2019/extlst" xmlns:r="http://schemas.openxmlformats.org/officeDocument/2006/relationships" xmlns:m="http://schemas.openxmlformats.org/officeDocument/2006/math" xmlns:v="urn:schemas-microsoft-com:vml" xmlns:wp14="http://schemas.microsoft.com/office/word/2010/wordprocessingDrawing" xmlns:wp="http://schemas.openxmlformats.org/drawingml/2006/wordprocessingDrawing" xmlns:w10="urn:schemas-microsoft-com:office:word" xmlns:w="http://schemas.openxmlformats.org/wordprocessingml/2006/main" xmlns:w14="http://schemas.microsoft.com/office/word/2010/wordml" xmlns:w15="http://schemas.microsoft.com/office/word/2012/wordml" xmlns:w16cex="http://schemas.microsoft.com/office/word/2018/wordml/cex" xmlns:w16cid="http://schemas.microsoft.com/office/word/2016/wordml/cid" xmlns:w16="http://schemas.microsoft.com/office/word/2018/wordml" xmlns:w16du="http://schemas.microsoft.com/office/word/2023/wordml/word16du" xmlns:w16sdtdh="http://schemas.microsoft.com/office/word/2020/wordml/sdtdatahash" xmlns:w16sdtfl="http://schemas.microsoft.com/office/word/2024/wordml/sdtformatlock" xmlns:w16se="http://schemas.microsoft.com/office/word/2015/wordml/symex" xmlns:wpg="http://schemas.microsoft.com/office/word/2010/wordprocessingGroup" xmlns:wpi="http://schemas.microsoft.com/office/word/2010/wordprocessingInk" xmlns:wne="http://schemas.microsoft.com/office/word/2006/wordml" xmlns:wps="http://schemas.microsoft.com/office/word/2010/wordprocessingShape" mc:Ignorable="w14 w15 w16se w16cid w16 w16cex w16sdtdh w16sdtfl w16du wp14">
+  <w:abstractNum w:abstractNumId="0" w15:restartNumberingAfterBreak="0">
+    <w:nsid w:val="242F4673"/>
+    <w:multiLevelType w:val="hybridMultilevel"/>
+    <w:tmpl w:val="C13A5316"/>
+    <w:lvl w:ilvl="0" w:tplc="2000000F">
+      <w:start w:val="1"/>
+      <w:numFmt w:val="decimal"/>
+      <w:lvlText w:val="%1."/>
+      <w:lvlJc w:val="left"/>
+      <w:pPr>
+        <w:ind w:left="720" w:hanging="360"/>
+      </w:pPr>
+      <w:rPr>
+        <w:rFonts w:hint="default"/>
+      </w:rPr>
+    </w:lvl>
+    <w:lvl w:ilvl="1" w:tplc="20000019" w:tentative="1">
+      <w:start w:val="1"/>
+      <w:numFmt w:val="lowerLetter"/>
+      <w:lvlText w:val="%2."/>
+      <w:lvlJc w:val="left"/>
+      <w:pPr>
+        <w:ind w:left="1440" w:hanging="360"/>
+      </w:pPr>
+    </w:lvl>
+    <w:lvl w:ilvl="2" w:tplc="2000001B" w:tentative="1">
+      <w:start w:val="1"/>
+      <w:numFmt w:val="lowerRoman"/>
+      <w:lvlText w:val="%3."/>
+      <w:lvlJc w:val="right"/>
+      <w:pPr>
+        <w:ind w:left="2160" w:hanging="180"/>
+      </w:pPr>
+    </w:lvl>
+    <w:lvl w:ilvl="3" w:tplc="2000000F" w:tentative="1">
+      <w:start w:val="1"/>
+      <w:numFmt w:val="decimal"/>
+      <w:lvlText w:val="%4."/>
+      <w:lvlJc w:val="left"/>
+      <w:pPr>
+        <w:ind w:left="2880" w:hanging="360"/>
+      </w:pPr>
+    </w:lvl>
+    <w:lvl w:ilvl="4" w:tplc="20000019" w:tentative="1">
+      <w:start w:val="1"/>
+      <w:numFmt w:val="lowerLetter"/>
+      <w:lvlText w:val="%5."/>
+      <w:lvlJc w:val="left"/>
+      <w:pPr>
+        <w:ind w:left="3600" w:hanging="360"/>
+      </w:pPr>
+    </w:lvl>
+    <w:lvl w:ilvl="5" w:tplc="2000001B" w:tentative="1">
+      <w:start w:val="1"/>
+      <w:numFmt w:val="lowerRoman"/>
+      <w:lvlText w:val="%6."/>
+      <w:lvlJc w:val="right"/>
+      <w:pPr>
+        <w:ind w:left="4320" w:hanging="180"/>
+      </w:pPr>
+    </w:lvl>
+    <w:lvl w:ilvl="6" w:tplc="2000000F" w:tentative="1">
+      <w:start w:val="1"/>
+      <w:numFmt w:val="decimal"/>
+      <w:lvlText w:val="%7."/>
+      <w:lvlJc w:val="left"/>
+      <w:pPr>
+        <w:ind w:left="5040" w:hanging="360"/>
+      </w:pPr>
+    </w:lvl>
+    <w:lvl w:ilvl="7" w:tplc="20000019" w:tentative="1">
+      <w:start w:val="1"/>
+      <w:numFmt w:val="lowerLetter"/>
+      <w:lvlText w:val="%8."/>
+      <w:lvlJc w:val="left"/>
+      <w:pPr>
+        <w:ind w:left="5760" w:hanging="360"/>
+      </w:pPr>
+    </w:lvl>
+    <w:lvl w:ilvl="8" w:tplc="2000001B" w:tentative="1">
+      <w:start w:val="1"/>
+      <w:numFmt w:val="lowerRoman"/>
+      <w:lvlText w:val="%9."/>
+      <w:lvlJc w:val="right"/>
+      <w:pPr>
+        <w:ind w:left="6480" w:hanging="180"/>
+      </w:pPr>
+    </w:lvl>
+  </w:abstractNum>
+  <w:abstractNum w:abstractNumId="1" w15:restartNumberingAfterBreak="0">
+    <w:nsid w:val="5E5D5F15"/>
+    <w:multiLevelType w:val="hybridMultilevel"/>
+    <w:tmpl w:val="EEDADC96"/>
+    <w:lvl w:ilvl="0" w:tplc="2000000F">
+      <w:start w:val="1"/>
+      <w:numFmt w:val="decimal"/>
+      <w:lvlText w:val="%1."/>
+      <w:lvlJc w:val="left"/>
+      <w:pPr>
+        <w:ind w:left="720" w:hanging="360"/>
+      </w:pPr>
+      <w:rPr>
+        <w:rFonts w:hint="default"/>
+      </w:rPr>
+    </w:lvl>
+    <w:lvl w:ilvl="1" w:tplc="20000019" w:tentative="1">
+      <w:start w:val="1"/>
+      <w:numFmt w:val="lowerLetter"/>
+      <w:lvlText w:val="%2."/>
+      <w:lvlJc w:val="left"/>
+      <w:pPr>
+        <w:ind w:left="1440" w:hanging="360"/>
+      </w:pPr>
+    </w:lvl>
+    <w:lvl w:ilvl="2" w:tplc="2000001B" w:tentative="1">
+      <w:start w:val="1"/>
+      <w:numFmt w:val="lowerRoman"/>
+      <w:lvlText w:val="%3."/>
+      <w:lvlJc w:val="right"/>
+      <w:pPr>
+        <w:ind w:left="2160" w:hanging="180"/>
+      </w:pPr>
+    </w:lvl>
+    <w:lvl w:ilvl="3" w:tplc="2000000F" w:tentative="1">
+      <w:start w:val="1"/>
+      <w:numFmt w:val="decimal"/>
+      <w:lvlText w:val="%4."/>
+      <w:lvlJc w:val="left"/>
+      <w:pPr>
+        <w:ind w:left="2880" w:hanging="360"/>
+      </w:pPr>
+    </w:lvl>
+    <w:lvl w:ilvl="4" w:tplc="20000019" w:tentative="1">
+      <w:start w:val="1"/>
+      <w:numFmt w:val="lowerLetter"/>
+      <w:lvlText w:val="%5."/>
+      <w:lvlJc w:val="left"/>
+      <w:pPr>
+        <w:ind w:left="3600" w:hanging="360"/>
+      </w:pPr>
+    </w:lvl>
+    <w:lvl w:ilvl="5" w:tplc="2000001B" w:tentative="1">
+      <w:start w:val="1"/>
+      <w:numFmt w:val="lowerRoman"/>
+      <w:lvlText w:val="%6."/>
+      <w:lvlJc w:val="right"/>
+      <w:pPr>
+        <w:ind w:left="4320" w:hanging="180"/>
+      </w:pPr>
+    </w:lvl>
+    <w:lvl w:ilvl="6" w:tplc="2000000F" w:tentative="1">
+      <w:start w:val="1"/>
+      <w:numFmt w:val="decimal"/>
+      <w:lvlText w:val="%7."/>
+      <w:lvlJc w:val="left"/>
+      <w:pPr>
+        <w:ind w:left="5040" w:hanging="360"/>
+      </w:pPr>
+    </w:lvl>
+    <w:lvl w:ilvl="7" w:tplc="20000019" w:tentative="1">
+      <w:start w:val="1"/>
+      <w:numFmt w:val="lowerLetter"/>
+      <w:lvlText w:val="%8."/>
+      <w:lvlJc w:val="left"/>
+      <w:pPr>
+        <w:ind w:left="5760" w:hanging="360"/>
+      </w:pPr>
+    </w:lvl>
+    <w:lvl w:ilvl="8" w:tplc="2000001B" w:tentative="1">
+      <w:start w:val="1"/>
+      <w:numFmt w:val="lowerRoman"/>
+      <w:lvlText w:val="%9."/>
+      <w:lvlJc w:val="right"/>
+      <w:pPr>
+        <w:ind w:left="6480" w:hanging="180"/>
+      </w:pPr>
+    </w:lvl>
+  </w:abstractNum>
+  <w:abstractNum w:abstractNumId="2" w15:restartNumberingAfterBreak="0">
+    <w:nsid w:val="63161D5D"/>
+    <w:multiLevelType w:val="hybridMultilevel"/>
+    <w:tmpl w:val="D3EEF52A"/>
+    <w:lvl w:ilvl="0" w:tplc="2000000F">
+      <w:start w:val="1"/>
+      <w:numFmt w:val="decimal"/>
+      <w:lvlText w:val="%1."/>
+      <w:lvlJc w:val="left"/>
+      <w:pPr>
+        <w:ind w:left="720" w:hanging="360"/>
+      </w:pPr>
+      <w:rPr>
+        <w:rFonts w:hint="default"/>
+      </w:rPr>
+    </w:lvl>
+    <w:lvl w:ilvl="1" w:tplc="20000019" w:tentative="1">
+      <w:start w:val="1"/>
+      <w:numFmt w:val="lowerLetter"/>
+      <w:lvlText w:val="%2."/>
+      <w:lvlJc w:val="left"/>
+      <w:pPr>
+        <w:ind w:left="1440" w:hanging="360"/>
+      </w:pPr>
+    </w:lvl>
+    <w:lvl w:ilvl="2" w:tplc="2000001B" w:tentative="1">
+      <w:start w:val="1"/>
+      <w:numFmt w:val="lowerRoman"/>
+      <w:lvlText w:val="%3."/>
+      <w:lvlJc w:val="right"/>
+      <w:pPr>
+        <w:ind w:left="2160" w:hanging="180"/>
+      </w:pPr>
+    </w:lvl>
+    <w:lvl w:ilvl="3" w:tplc="2000000F" w:tentative="1">
+      <w:start w:val="1"/>
+      <w:numFmt w:val="decimal"/>
+      <w:lvlText w:val="%4."/>
+      <w:lvlJc w:val="left"/>
+      <w:pPr>
+        <w:ind w:left="2880" w:hanging="360"/>
+      </w:pPr>
+    </w:lvl>
+    <w:lvl w:ilvl="4" w:tplc="20000019" w:tentative="1">
+      <w:start w:val="1"/>
+      <w:numFmt w:val="lowerLetter"/>
+      <w:lvlText w:val="%5."/>
+      <w:lvlJc w:val="left"/>
+      <w:pPr>
+        <w:ind w:left="3600" w:hanging="360"/>
+      </w:pPr>
+    </w:lvl>
+    <w:lvl w:ilvl="5" w:tplc="2000001B" w:tentative="1">
+      <w:start w:val="1"/>
+      <w:numFmt w:val="lowerRoman"/>
+      <w:lvlText w:val="%6."/>
+      <w:lvlJc w:val="right"/>
+      <w:pPr>
+        <w:ind w:left="4320" w:hanging="180"/>
+      </w:pPr>
+    </w:lvl>
+    <w:lvl w:ilvl="6" w:tplc="2000000F" w:tentative="1">
+      <w:start w:val="1"/>
+      <w:numFmt w:val="decimal"/>
+      <w:lvlText w:val="%7."/>
+      <w:lvlJc w:val="left"/>
+      <w:pPr>
+        <w:ind w:left="5040" w:hanging="360"/>
+      </w:pPr>
+    </w:lvl>
+    <w:lvl w:ilvl="7" w:tplc="20000019" w:tentative="1">
+      <w:start w:val="1"/>
+      <w:numFmt w:val="lowerLetter"/>
+      <w:lvlText w:val="%8."/>
+      <w:lvlJc w:val="left"/>
+      <w:pPr>
+        <w:ind w:left="5760" w:hanging="360"/>
+      </w:pPr>
+    </w:lvl>
+    <w:lvl w:ilvl="8" w:tplc="2000001B" w:tentative="1">
+      <w:start w:val="1"/>
+      <w:numFmt w:val="lowerRoman"/>
+      <w:lvlText w:val="%9."/>
+      <w:lvlJc w:val="right"/>
+      <w:pPr>
+        <w:ind w:left="6480" w:hanging="180"/>
+      </w:pPr>
+    </w:lvl>
+  </w:abstractNum>
+  <w:abstractNum w:abstractNumId="3" w15:restartNumberingAfterBreak="0">
+    <w:nsid w:val="67A57A88"/>
+    <w:multiLevelType w:val="hybridMultilevel"/>
+    <w:tmpl w:val="81D089FC"/>
+    <w:lvl w:ilvl="0" w:tplc="2000000F">
+      <w:start w:val="1"/>
+      <w:numFmt w:val="decimal"/>
+      <w:lvlText w:val="%1."/>
+      <w:lvlJc w:val="left"/>
+      <w:pPr>
+        <w:ind w:left="720" w:hanging="360"/>
+      </w:pPr>
+      <w:rPr>
+        <w:rFonts w:hint="default"/>
+      </w:rPr>
+    </w:lvl>
+    <w:lvl w:ilvl="1" w:tplc="20000019" w:tentative="1">
+      <w:start w:val="1"/>
+      <w:numFmt w:val="lowerLetter"/>
+      <w:lvlText w:val="%2."/>
+      <w:lvlJc w:val="left"/>
+      <w:pPr>
+        <w:ind w:left="1440" w:hanging="360"/>
+      </w:pPr>
+    </w:lvl>
+    <w:lvl w:ilvl="2" w:tplc="2000001B" w:tentative="1">
+      <w:start w:val="1"/>
+      <w:numFmt w:val="lowerRoman"/>
+      <w:lvlText w:val="%3."/>
+      <w:lvlJc w:val="right"/>
+      <w:pPr>
+        <w:ind w:left="2160" w:hanging="180"/>
+      </w:pPr>
+    </w:lvl>
+    <w:lvl w:ilvl="3" w:tplc="2000000F" w:tentative="1">
+      <w:start w:val="1"/>
+      <w:numFmt w:val="decimal"/>
+      <w:lvlText w:val="%4."/>
+      <w:lvlJc w:val="left"/>
+      <w:pPr>
+        <w:ind w:left="2880" w:hanging="360"/>
+      </w:pPr>
+    </w:lvl>
+    <w:lvl w:ilvl="4" w:tplc="20000019" w:tentative="1">
+      <w:start w:val="1"/>
+      <w:numFmt w:val="lowerLetter"/>
+      <w:lvlText w:val="%5."/>
+      <w:lvlJc w:val="left"/>
+      <w:pPr>
+        <w:ind w:left="3600" w:hanging="360"/>
+      </w:pPr>
+    </w:lvl>
+    <w:lvl w:ilvl="5" w:tplc="2000001B" w:tentative="1">
+      <w:start w:val="1"/>
+      <w:numFmt w:val="lowerRoman"/>
+      <w:lvlText w:val="%6."/>
+      <w:lvlJc w:val="right"/>
+      <w:pPr>
+        <w:ind w:left="4320" w:hanging="180"/>
+      </w:pPr>
+    </w:lvl>
+    <w:lvl w:ilvl="6" w:tplc="2000000F" w:tentative="1">
+      <w:start w:val="1"/>
+      <w:numFmt w:val="decimal"/>
+      <w:lvlText w:val="%7."/>
+      <w:lvlJc w:val="left"/>
+      <w:pPr>
+        <w:ind w:left="5040" w:hanging="360"/>
+      </w:pPr>
+    </w:lvl>
+    <w:lvl w:ilvl="7" w:tplc="20000019" w:tentative="1">
+      <w:start w:val="1"/>
+      <w:numFmt w:val="lowerLetter"/>
+      <w:lvlText w:val="%8."/>
+      <w:lvlJc w:val="left"/>
+      <w:pPr>
+        <w:ind w:left="5760" w:hanging="360"/>
+      </w:pPr>
+    </w:lvl>
+    <w:lvl w:ilvl="8" w:tplc="2000001B" w:tentative="1">
+      <w:start w:val="1"/>
+      <w:numFmt w:val="lowerRoman"/>
+      <w:lvlText w:val="%9."/>
+      <w:lvlJc w:val="right"/>
+      <w:pPr>
+        <w:ind w:left="6480" w:hanging="180"/>
+      </w:pPr>
+    </w:lvl>
+  </w:abstractNum>
+  <w:num w:numId="1" w16cid:durableId="855198156">
+    <w:abstractNumId w:val="2"/>
+  </w:num>
+  <w:num w:numId="2" w16cid:durableId="1985767586">
+    <w:abstractNumId w:val="0"/>
+  </w:num>
+  <w:num w:numId="3" w16cid:durableId="200946013">
+    <w:abstractNumId w:val="1"/>
+  </w:num>
+  <w:num w:numId="4" w16cid:durableId="2023968384">
+    <w:abstractNumId w:val="3"/>
+  </w:num>
+</w:numbering>
 </file>
 
 <file path=word/styles.xml><?xml version="1.0" encoding="utf-8"?>
@@ -1465,6 +2220,50 @@
       <w:spacing w:val="5"/>
     </w:rPr>
   </w:style>
+  <w:style w:type="paragraph" w:styleId="Header">
+    <w:name w:val="header"/>
+    <w:basedOn w:val="Normal"/>
+    <w:link w:val="HeaderChar"/>
+    <w:uiPriority w:val="99"/>
+    <w:unhideWhenUsed/>
+    <w:rsid w:val="006A3857"/>
+    <w:pPr>
+      <w:tabs>
+        <w:tab w:val="center" w:pos="4819"/>
+        <w:tab w:val="right" w:pos="9638"/>
+      </w:tabs>
+      <w:spacing w:after="0" w:line="240" w:lineRule="auto"/>
+    </w:pPr>
+  </w:style>
+  <w:style w:type="character" w:customStyle="1" w:styleId="HeaderChar">
+    <w:name w:val="Header Char"/>
+    <w:basedOn w:val="DefaultParagraphFont"/>
+    <w:link w:val="Header"/>
+    <w:uiPriority w:val="99"/>
+    <w:rsid w:val="006A3857"/>
+  </w:style>
+  <w:style w:type="paragraph" w:styleId="Footer">
+    <w:name w:val="footer"/>
+    <w:basedOn w:val="Normal"/>
+    <w:link w:val="FooterChar"/>
+    <w:uiPriority w:val="99"/>
+    <w:unhideWhenUsed/>
+    <w:rsid w:val="006A3857"/>
+    <w:pPr>
+      <w:tabs>
+        <w:tab w:val="center" w:pos="4819"/>
+        <w:tab w:val="right" w:pos="9638"/>
+      </w:tabs>
+      <w:spacing w:after="0" w:line="240" w:lineRule="auto"/>
+    </w:pPr>
+  </w:style>
+  <w:style w:type="character" w:customStyle="1" w:styleId="FooterChar">
+    <w:name w:val="Footer Char"/>
+    <w:basedOn w:val="DefaultParagraphFont"/>
+    <w:link w:val="Footer"/>
+    <w:uiPriority w:val="99"/>
+    <w:rsid w:val="006A3857"/>
+  </w:style>
 </w:styles>
 </file>
 

</xml_diff>